<commit_message>
Rescore Invoca 81 -> 90 after confirming Salesloft/ZoomInfo/Gong and automation history
Josh confirmed hands-on use of Invoca's exact named GTM stack (Salesloft,
ZoomInfo, Gong), an automation-building history running Zapier at Accelo
(2018-2020) through Make/n8n at Solenzo today, and a real Solenzo
concurrency number (up to 3 clients at once). Updated resume, fit score,
and match report accordingly. Added these as permanent master-profile
facts (tools/platforms table, Accelo and Solenzo bullet banks) so they're
available for every future application, not just this one. Also recorded
a private, non-resume note explaining why Solenzo's monthly lead-volume
metric isn't reliably capturable, so it stops getting re-asked.

Co-Authored-By: Claude Sonnet 5 <noreply@anthropic.com>
Claude-Session: https://claude.ai/code/session_01WyTDmPmJhaMoZNuKsZg2t7
</commit_message>
<xml_diff>
--- a/applications/invoca-revenue-operations-manager/Rotenberg Resume - Invoca - Revenue Operations Manager.docx
+++ b/applications/invoca-revenue-operations-manager/Rotenberg Resume - Invoca - Revenue Operations Manager.docx
@@ -80,7 +80,7 @@
           <w:i w:val="0"/>
           <w:color w:val="1A1A1A"/>
         </w:rPr>
-        <w:t>Revenue operations professional with 15+ years building the pipeline, lead-routing, and reporting infrastructure that keeps B2B SaaS GTM engines running, spanning Salesforce, HubSpot, GoHighLevel, and Accelo's own CRM/PSA platform. Personally designs, builds, and deploys AI-driven workflows and automations at Solenzo, not just directs others to, including a full lead capture-to-close automation system and a digital-footprint scoring engine that enrolled 180+ contacts. Comfortable owning day-to-day operational fundamentals (lead routing, data hygiene, reporting) while designing scalable processes that hold up as an organization grows, evidenced by driving a brand-new Wix vertical from proof of concept to a profitable business line.</w:t>
+        <w:t>Revenue operations professional with 15+ years building the pipeline, lead-routing, and reporting infrastructure that keeps B2B SaaS GTM engines running, with hands-on experience across Salesforce, Salesloft, ZoomInfo, and Gong, plus Zapier, Make, and n8n automation-building dating back to Accelo in 2018. Personally designs, builds, and deploys AI-driven workflows at Solenzo, not just directs others to, including a full lead capture-to-close automation system and a digital-footprint scoring engine that enrolled 180+ contacts. Comfortable owning day-to-day operational fundamentals while designing scalable processes that hold up as an organization grows, evidenced by driving a brand-new Wix vertical from proof of concept to a profitable business line.</w:t>
       </w:r>
     </w:p>
     <w:p>
@@ -297,7 +297,31 @@
           <w:i w:val="0"/>
           <w:color w:val="1A1A1A"/>
         </w:rPr>
-        <w:t>Build reusable agent infrastructure and internal tooling integrating with client CRMs and CMS platforms for automated growth engines.</w:t>
+        <w:t>Build reusable agent infrastructure and internal tooling in Make and n8n, integrating with client CRMs and CMS platforms for automated growth engines.</w:t>
+      </w:r>
+    </w:p>
+    <w:p>
+      <w:pPr>
+        <w:spacing w:after="30"/>
+        <w:ind w:left="259" w:hanging="259"/>
+      </w:pPr>
+      <w:r>
+        <w:rPr>
+          <w:rFonts w:ascii="Calibri" w:hAnsi="Calibri"/>
+          <w:b w:val="0"/>
+          <w:i w:val="0"/>
+          <w:color w:val="163A5F"/>
+        </w:rPr>
+        <w:t xml:space="preserve">•  </w:t>
+      </w:r>
+      <w:r>
+        <w:rPr>
+          <w:rFonts w:ascii="Calibri" w:hAnsi="Calibri"/>
+          <w:b w:val="0"/>
+          <w:i w:val="0"/>
+          <w:color w:val="1A1A1A"/>
+        </w:rPr>
+        <w:t>Run up to 3 concurrent client engagements at a time while personally building and operating the outbound automation system, from strategy through hands-on execution.</w:t>
       </w:r>
     </w:p>
     <w:p>
@@ -807,7 +831,31 @@
           <w:i w:val="0"/>
           <w:color w:val="1A1A1A"/>
         </w:rPr>
-        <w:t>Sold and scoped complex CRM and project-management software to agencies and professional-services firms, with deep fluency in sales enablement, contact management, and pipeline automation.</w:t>
+        <w:t>Sold and scoped complex CRM and project-management software to agencies and professional-services firms, with deep fluency in sales enablement, contact management, pipeline automation, and forecast-stage tracking.</w:t>
+      </w:r>
+    </w:p>
+    <w:p>
+      <w:pPr>
+        <w:spacing w:after="30"/>
+        <w:ind w:left="259" w:hanging="259"/>
+      </w:pPr>
+      <w:r>
+        <w:rPr>
+          <w:rFonts w:ascii="Calibri" w:hAnsi="Calibri"/>
+          <w:b w:val="0"/>
+          <w:i w:val="0"/>
+          <w:color w:val="163A5F"/>
+        </w:rPr>
+        <w:t xml:space="preserve">•  </w:t>
+      </w:r>
+      <w:r>
+        <w:rPr>
+          <w:rFonts w:ascii="Calibri" w:hAnsi="Calibri"/>
+          <w:b w:val="0"/>
+          <w:i w:val="0"/>
+          <w:color w:val="1A1A1A"/>
+        </w:rPr>
+        <w:t>Built Zapier automations to reduce manual work across the sales process, hands-on automation-building experience that predates Solenzo by several years.</w:t>
       </w:r>
     </w:p>
     <w:p>
@@ -944,7 +992,7 @@
           <w:i w:val="0"/>
           <w:color w:val="1A1A1A"/>
         </w:rPr>
-        <w:t>Hands-On AI Workflow Build &amp; Deployment (Agentic AI / LLM), Digital-Footprint Scoring &amp; Personalization Engines, Process Automation Design, Rapid Prototyping &amp; Testing</w:t>
+        <w:t>Hands-On AI Workflow Build &amp; Deployment (Agentic AI / LLM), Zapier, Make, n8n, Digital-Footprint Scoring &amp; Personalization Engines, Rapid Prototyping &amp; Testing</w:t>
       </w:r>
     </w:p>
     <w:p>
@@ -967,7 +1015,7 @@
           <w:i w:val="0"/>
           <w:color w:val="1A1A1A"/>
         </w:rPr>
-        <w:t>Salesforce, HubSpot, GoHighLevel, Accelo (CRM/PSA), Contact Segmentation &amp; Lifecycle Stages</w:t>
+        <w:t>Salesforce, Salesloft, ZoomInfo, Gong, HubSpot, GoHighLevel, Accelo (CRM/PSA), Contact Segmentation &amp; Lifecycle Stages</w:t>
       </w:r>
     </w:p>
     <w:p>

</xml_diff>